<commit_message>
Correct four statements the deliverable check found in the form report
The solvers are standard library Python, not NumPy, and the checking
script is not in the zip. The load model is scaled to the design
thrust, not to a measured mean. The FOS column no longer breaks words,
and the concept comparison says which table it wins.
</commit_message>
<xml_diff>
--- a/stage-1/submission/form/CycloProp_TM-5A7C41AF909_Stage1_Report.docx
+++ b/stage-1/submission/form/CycloProp_TM-5A7C41AF909_Stage1_Report.docx
@@ -10183,7 +10183,7 @@
         </w:rPr>
       </w:pPr>
       <w:r>
-        <w:t>It wins the criterion the challenge makes hard, module thrust to weight, by 23 percent on the stacked downside case (2.1281 against 1.7286), and it wins every other column apart from aerodynamic power, where the clusters are about 3 percent better. Splitting the thrust splits the aerodynamics but not the hardware: 7 of the 13 mass envelope lines multiply by rotor count. Every disputed assumption was set in the clusters' favour, with no wake interaction, one shared motor and controller, and the same coefficient despite their lower Reynolds number.</w:t>
+        <w:t>It wins the criterion the challenge makes hard, module thrust to weight, by 23 percent on the stacked downside case (2.1281 against 1.7286), and it wins every other column of the 3.1 table apart from aerodynamic power, where the clusters are 2 to 3 percent better. Splitting the thrust splits the aerodynamics but not the hardware: 7 of the 13 mass envelope lines multiply by rotor count. Every disputed assumption was set in the clusters' favour, with no wake interaction, one shared motor and controller, and the same coefficient despite their lower Reynolds number.</w:t>
       </w:r>
     </w:p>
     <w:p>
@@ -12978,7 +12978,7 @@
                 <w:b w:val="0"/>
                 <w:sz w:val="18"/>
               </w:rPr>
-              <w:t>Python 3 with NumPy and Matplotlib. tools/linkage.py (kinematics and loads), tools/structure.py (structure and mass), tools/check.py (recomputes and checks every number). All inputs and results in numbers.json</w:t>
+              <w:t>Python 3, standard library only: tools/linkage.py (kinematics and loads) and tools/structure.py (structure and mass), both in the zip. All inputs and results in numbers.json. Figures drawn with Matplotlib</w:t>
             </w:r>
           </w:p>
         </w:tc>
@@ -13540,7 +13540,7 @@
         </w:rPr>
       </w:pPr>
       <w:r>
-        <w:t>Blade area thrust coefficient 0.6055 nominal and 0.5752 low (5% flexibility loss). It is bracketed by 0.6648 measured by Kellen on this shape family [1], 0.7211 recomputed from Benedict's quad rotor hover point [2] and 0.8114 from his twin rotor, which we treat as an upside only. The load model uses a thin airfoil lift slope of 2 pi per radian, scaled to the measured mean.</w:t>
+        <w:t>Blade area thrust coefficient 0.6055 nominal and 0.5752 low (5% flexibility loss). It is bracketed by 0.6648 measured by Kellen on this shape family [1], 0.7211 recomputed from Benedict's quad rotor hover point [2] and 0.8114 from his twin rotor, which we treat as an upside only. The load model uses a thin airfoil lift slope of 2 pi per radian, scaled so the cycle mean equals the 17.0 N design thrust.</w:t>
       </w:r>
     </w:p>
     <w:p>
@@ -27979,7 +27979,7 @@
                 <w:b w:val="0"/>
                 <w:sz w:val="18"/>
               </w:rPr>
-              <w:t>3.00 (2.08 at overspeed)</w:t>
+              <w:t>3.00 / 2.08</w:t>
             </w:r>
           </w:p>
         </w:tc>
@@ -28359,7 +28359,7 @@
                 <w:b w:val="0"/>
                 <w:sz w:val="18"/>
               </w:rPr>
-              <w:t>not computed</w:t>
+              <w:t>not computed; stiffness governs</w:t>
             </w:r>
           </w:p>
         </w:tc>
@@ -28429,7 +28429,7 @@
                 <w:b w:val="0"/>
                 <w:sz w:val="18"/>
               </w:rPr>
-              <w:t>over 100; stiffness governs, not strength</w:t>
+              <w:t>&gt; 100</w:t>
             </w:r>
           </w:p>
         </w:tc>
@@ -28654,7 +28654,7 @@
                 <w:b w:val="0"/>
                 <w:sz w:val="18"/>
               </w:rPr>
-              <w:t>3.73 (2.59 at overspeed)</w:t>
+              <w:t>3.73 / 2.59</w:t>
             </w:r>
           </w:p>
         </w:tc>
@@ -28917,7 +28917,7 @@
         </w:rPr>
       </w:pPr>
       <w:r>
-        <w:t>Closed form, in tools/structure.py. Beam bending on the blade section integrated from its own ordinates (EI 51.115 Nm2, GJ 7.8058 Nm2), with the skin wrinkling stress 0.5 x (E_skin E_core G_core)^(1/3). Thin wall torsion and combined shear on the shaft, net section bending on the horn, and the ISO 76 static rating for the bearings. FOS is allowable over demand. Stresses in the table are the demand scaled onto the governing allowable.</w:t>
+        <w:t>Closed form, in tools/structure.py. Beam bending on the blade section integrated from its own ordinates (EI 51.115 Nm2, GJ 7.8058 Nm2), with the skin wrinkling stress 0.5 x (E_skin E_core G_core)^(1/3). Thin wall torsion and combined shear on the shaft, net section bending on the horn, and the ISO 76 static rating for the bearings. FOS is allowable over demand; where two are given, the second is the 1.20 overspeed case. Stresses in the table are the demand scaled onto the governing allowable.</w:t>
       </w:r>
     </w:p>
     <w:p>
@@ -39837,77 +39837,77 @@
                 <w:b w:val="0"/>
                 <w:sz w:val="18"/>
               </w:rPr>
-              <w:t>Python 3, NumPy, Matplotlib</w:t>
-            </w:r>
-          </w:p>
-        </w:tc>
-        <w:tc>
-          <w:tcPr>
-            <w:tcBorders>
-              <w:top w:color="000000" w:space="0" w:sz="0" w:val="nil"/>
-              <w:left w:color="000000" w:space="0" w:sz="0" w:val="nil"/>
-              <w:bottom w:color="000000" w:space="0" w:sz="8" w:val="single"/>
-              <w:right w:color="000000" w:space="0" w:sz="8" w:val="single"/>
-            </w:tcBorders>
-            <w:shd w:fill="auto" w:val="clear"/>
-            <w:tcMar>
-              <w:top w:w="0.0" w:type="dxa"/>
-              <w:left w:w="100.0" w:type="dxa"/>
-              <w:bottom w:w="0.0" w:type="dxa"/>
-              <w:right w:w="100.0" w:type="dxa"/>
-            </w:tcMar>
-            <w:vAlign w:val="top"/>
-          </w:tcPr>
-          <w:p>
-            <w:pPr>
-              <w:widowControl w:val="0"/>
-              <w:rPr>
-                <w:rFonts w:ascii="Verdana" w:cs="Verdana" w:eastAsia="Verdana" w:hAnsi="Verdana"/>
-                <w:color w:val="181800"/>
-              </w:rPr>
-            </w:pPr>
-            <w:r>
-              <w:rPr>
-                <w:rFonts w:ascii="Verdana" w:hAnsi="Verdana"/>
-                <w:b w:val="0"/>
-                <w:sz w:val="18"/>
-              </w:rPr>
-              <w:t>All calculations and figures</w:t>
-            </w:r>
-          </w:p>
-        </w:tc>
-        <w:tc>
-          <w:tcPr>
-            <w:tcBorders>
-              <w:top w:color="000000" w:space="0" w:sz="0" w:val="nil"/>
-              <w:left w:color="000000" w:space="0" w:sz="0" w:val="nil"/>
-              <w:bottom w:color="000000" w:space="0" w:sz="8" w:val="single"/>
-              <w:right w:color="000000" w:space="0" w:sz="8" w:val="single"/>
-            </w:tcBorders>
-            <w:shd w:fill="auto" w:val="clear"/>
-            <w:tcMar>
-              <w:top w:w="0.0" w:type="dxa"/>
-              <w:left w:w="100.0" w:type="dxa"/>
-              <w:bottom w:w="0.0" w:type="dxa"/>
-              <w:right w:w="100.0" w:type="dxa"/>
-            </w:tcMar>
-            <w:vAlign w:val="top"/>
-          </w:tcPr>
-          <w:p>
-            <w:pPr>
-              <w:widowControl w:val="0"/>
-              <w:rPr>
-                <w:rFonts w:ascii="Verdana" w:cs="Verdana" w:eastAsia="Verdana" w:hAnsi="Verdana"/>
-                <w:color w:val="181800"/>
-              </w:rPr>
-            </w:pPr>
-            <w:r>
-              <w:rPr>
-                <w:rFonts w:ascii="Verdana" w:hAnsi="Verdana"/>
-                <w:b w:val="0"/>
-                <w:sz w:val="18"/>
-              </w:rPr>
-              <w:t>Open source libraries</w:t>
+              <w:t>Python 3, Matplotlib</w:t>
+            </w:r>
+          </w:p>
+        </w:tc>
+        <w:tc>
+          <w:tcPr>
+            <w:tcBorders>
+              <w:top w:color="000000" w:space="0" w:sz="0" w:val="nil"/>
+              <w:left w:color="000000" w:space="0" w:sz="0" w:val="nil"/>
+              <w:bottom w:color="000000" w:space="0" w:sz="8" w:val="single"/>
+              <w:right w:color="000000" w:space="0" w:sz="8" w:val="single"/>
+            </w:tcBorders>
+            <w:shd w:fill="auto" w:val="clear"/>
+            <w:tcMar>
+              <w:top w:w="0.0" w:type="dxa"/>
+              <w:left w:w="100.0" w:type="dxa"/>
+              <w:bottom w:w="0.0" w:type="dxa"/>
+              <w:right w:w="100.0" w:type="dxa"/>
+            </w:tcMar>
+            <w:vAlign w:val="top"/>
+          </w:tcPr>
+          <w:p>
+            <w:pPr>
+              <w:widowControl w:val="0"/>
+              <w:rPr>
+                <w:rFonts w:ascii="Verdana" w:cs="Verdana" w:eastAsia="Verdana" w:hAnsi="Verdana"/>
+                <w:color w:val="181800"/>
+              </w:rPr>
+            </w:pPr>
+            <w:r>
+              <w:rPr>
+                <w:rFonts w:ascii="Verdana" w:hAnsi="Verdana"/>
+                <w:b w:val="0"/>
+                <w:sz w:val="18"/>
+              </w:rPr>
+              <w:t>All calculations (standard library) and figures</w:t>
+            </w:r>
+          </w:p>
+        </w:tc>
+        <w:tc>
+          <w:tcPr>
+            <w:tcBorders>
+              <w:top w:color="000000" w:space="0" w:sz="0" w:val="nil"/>
+              <w:left w:color="000000" w:space="0" w:sz="0" w:val="nil"/>
+              <w:bottom w:color="000000" w:space="0" w:sz="8" w:val="single"/>
+              <w:right w:color="000000" w:space="0" w:sz="8" w:val="single"/>
+            </w:tcBorders>
+            <w:shd w:fill="auto" w:val="clear"/>
+            <w:tcMar>
+              <w:top w:w="0.0" w:type="dxa"/>
+              <w:left w:w="100.0" w:type="dxa"/>
+              <w:bottom w:w="0.0" w:type="dxa"/>
+              <w:right w:w="100.0" w:type="dxa"/>
+            </w:tcMar>
+            <w:vAlign w:val="top"/>
+          </w:tcPr>
+          <w:p>
+            <w:pPr>
+              <w:widowControl w:val="0"/>
+              <w:rPr>
+                <w:rFonts w:ascii="Verdana" w:cs="Verdana" w:eastAsia="Verdana" w:hAnsi="Verdana"/>
+                <w:color w:val="181800"/>
+              </w:rPr>
+            </w:pPr>
+            <w:r>
+              <w:rPr>
+                <w:rFonts w:ascii="Verdana" w:hAnsi="Verdana"/>
+                <w:b w:val="0"/>
+                <w:sz w:val="18"/>
+              </w:rPr>
+              <w:t>Open source</w:t>
             </w:r>
           </w:p>
         </w:tc>
@@ -43425,7 +43425,7 @@
         <w:rPr>
           <w:i w:val="0"/>
         </w:rPr>
-        <w:t>Folder 04_Design_Record holds the design documents for each item, the evidence ledger that grades every borrowed number, and the decision log, 72 dated entries recording each change in section 13.1 and why it was made.</w:t>
+        <w:t>Folder 04_Design_Record holds the design document for each item and the evidence ledger that grades every borrowed number by how it was obtained. The design documents cite numbered, dated decisions (for example D67 for the V2 change in section 13.1). The full decision log is available on request.</w:t>
       </w:r>
     </w:p>
     <w:p>

</xml_diff>

<commit_message>
Point the report appendices at the new upload folders
</commit_message>
<xml_diff>
--- a/stage-1/submission/form/CycloProp_TM-5A7C41AF909_Stage1_Report.docx
+++ b/stage-1/submission/form/CycloProp_TM-5A7C41AF909_Stage1_Report.docx
@@ -43242,7 +43242,7 @@
         <w:rPr>
           <w:i w:val="0"/>
         </w:rPr>
-        <w:t>Supporting files in the zip, folder 03_Calculations: stage-1/design/numbers.json holds every input and result; tools/linkage.py solves the four-bar, the pitch schedule, the aerodynamic loads and the vector map; tools/structure.py builds the blade section, the margins and the mass budget. Both are plain Python 3 with no third party packages. Running python tools/linkage.py --write and then python tools/structure.py --write regenerates numbers.json byte for byte. The 32 page detailed design note in folder 02_Detailed_Design_Note carries every calculation in prose.</w:t>
+        <w:t>Supporting files in the zip, folder 04_Calculations: stage-1/design/numbers.json holds every input and result; tools/linkage.py solves the four-bar, the pitch schedule, the aerodynamic loads and the vector map; tools/structure.py builds the blade section, the margins and the mass budget. Both are plain Python 3 with no third party packages. Running python tools/linkage.py --write and then python tools/structure.py --write regenerates numbers.json byte for byte. The 32 page detailed design note in folder 02_Detailed_Design_Note carries every calculation in prose.</w:t>
       </w:r>
     </w:p>
     <w:p>
@@ -43364,7 +43364,7 @@
         <w:rPr>
           <w:i w:val="0"/>
         </w:rPr>
-        <w:t>No CAD model exists at Stage 1. The dimensioned layout is Figure 1, the blade section Figure 3 and the linkage Figure 5, all drawn from the same numbers file. The packaging and interface definition is in 04_Design_Record/09-packaging-and-integration.md.</w:t>
+        <w:t>No CAD model exists at Stage 1. The dimensioned layout is Figure 1, the blade section Figure 3 and the linkage Figure 5, all drawn from the same numbers file. The packaging and interface definition is in the Packaging and integration chapter of 03_Design_Record.</w:t>
       </w:r>
     </w:p>
     <w:p>
@@ -43425,7 +43425,7 @@
         <w:rPr>
           <w:i w:val="0"/>
         </w:rPr>
-        <w:t>Folder 04_Design_Record holds the design document for each item and the evidence ledger that grades every borrowed number by how it was obtained. The design documents cite numbered, dated decisions (for example D67 for the V2 change in section 13.1). The full decision log is available on request.</w:t>
+        <w:t>Folder 03_Design_Record holds the design document for each item and the evidence ledger that grades every borrowed number by how it was obtained. The design documents cite numbered, dated decisions (for example D67 for the V2 change in section 13.1). The full decision log is available on request.</w:t>
       </w:r>
     </w:p>
     <w:p>

</xml_diff>